<commit_message>
Add corrected out-of-fold confusion matrices and finalize reduction stats
Confusion matrices (Figure 4) and stemming-reduction percentages now
come from the corrected diagnostics_experiment_colab.py run (lead-
supported classes only for aVR/V2/V6). Key finding: IPL, the rarest
pathological class, is poorly recognized on 3 of 4 leads (6% recall)
regardless of classifier -- a data-availability limitation, not an
algorithmic one. V2 stands out for markedly better AS recall (81%)
than other leads.
</commit_message>
<xml_diff>
--- a/docs/classifier_comparison_article_EN.docx
+++ b/docs/classifier_comparison_article_EN.docx
@@ -560,7 +560,7 @@
                 <w:b w:val="false"/>
                 <w:bCs w:val="false"/>
               </w:rPr>
-              <w:t xml:space="preserve">80.6% †</w:t>
+              <w:t xml:space="preserve">80.5%</w:t>
             </w:r>
           </w:p>
         </w:tc>
@@ -613,7 +613,7 @@
                 <w:b w:val="false"/>
                 <w:bCs w:val="false"/>
               </w:rPr>
-              <w:t xml:space="preserve">79.3% †</w:t>
+              <w:t xml:space="preserve">79.7%</w:t>
             </w:r>
           </w:p>
         </w:tc>
@@ -666,26 +666,12 @@
                 <w:b w:val="false"/>
                 <w:bCs w:val="false"/>
               </w:rPr>
-              <w:t xml:space="preserve">77.6% †</w:t>
+              <w:t xml:space="preserve">77.7%</w:t>
             </w:r>
           </w:p>
         </w:tc>
       </w:tr>
     </w:tbl>
-    <w:p>
-      <w:pPr>
-        <w:spacing w:after="160"/>
-      </w:pPr>
-      <w:r>
-        <w:rPr>
-          <w:i/>
-          <w:iCs/>
-          <w:sz w:val="17"/>
-          <w:szCs w:val="17"/>
-        </w:rPr>
-        <w:t xml:space="preserve">† These three values were computed before the class-label fix in Section 5 and may shift slightly once tools/diagnostics_experiment_colab.py is re-run on lead-filtered data; Lead I is unaffected by that fix.</w:t>
-      </w:r>
-    </w:p>
     <w:p>
       <w:pPr>
         <w:spacing w:after="160"/>
@@ -3346,7 +3332,162 @@
           <w:b/>
           <w:bCs/>
         </w:rPr>
-        <w:t xml:space="preserve">3.3 Where does Random Forest actually succeed and fail?</w:t>
+        <w:t xml:space="preserve">3.3 Where does Random Forest actually succeed and fail? Out-of-fold confusion matrices</w:t>
+      </w:r>
+    </w:p>
+    <w:p>
+      <w:pPr>
+        <w:spacing w:after="160"/>
+      </w:pPr>
+      <w:r>
+        <w:t xml:space="preserve">Aggregate Macro-F1 hides which specific confusions drive the score. The matrices below combine every patient's out-of-fold prediction (each patient predicted exactly once, from a fold that never saw them during training) into a single confusion matrix per lead, for Random Forest — the overall winning method. aVR, V2, and V6 are shown with their four supported classes only, reflecting the fix in Section 5.</w:t>
+      </w:r>
+    </w:p>
+    <w:p>
+      <w:pPr>
+        <w:spacing w:after="80" w:before="240"/>
+        <w:jc w:val="center"/>
+      </w:pPr>
+      <w:r>
+        <w:drawing>
+          <wp:inline distT="0" distB="0" distL="0" distR="0">
+            <wp:extent cx="5524500" cy="5772150"/>
+            <wp:effectExtent t="0" r="0" b="0" l="0"/>
+            <wp:docPr id="1" name="" descr="" title=""/>
+            <wp:cNvGraphicFramePr>
+              <a:graphicFrameLocks xmlns:a="http://schemas.openxmlformats.org/drawingml/2006/main" noChangeAspect="1"/>
+            </wp:cNvGraphicFramePr>
+            <a:graphic xmlns:a="http://schemas.openxmlformats.org/drawingml/2006/main">
+              <a:graphicData uri="http://schemas.openxmlformats.org/drawingml/2006/picture">
+                <pic:pic xmlns:pic="http://schemas.openxmlformats.org/drawingml/2006/picture">
+                  <pic:nvPicPr>
+                    <pic:cNvPr id="0" name="" descr=""/>
+                    <pic:cNvPicPr>
+                      <a:picLocks noChangeAspect="1" noChangeArrowheads="1"/>
+                    </pic:cNvPicPr>
+                  </pic:nvPicPr>
+                  <pic:blipFill>
+                    <a:blip r:embed="rId10" cstate="none"/>
+                    <a:srcRect/>
+                    <a:stretch>
+                      <a:fillRect/>
+                    </a:stretch>
+                  </pic:blipFill>
+                  <pic:spPr bwMode="auto">
+                    <a:xfrm>
+                      <a:off x="0" y="0"/>
+                      <a:ext cx="5524500" cy="5772150"/>
+                    </a:xfrm>
+                    <a:prstGeom prst="rect">
+                      <a:avLst/>
+                    </a:prstGeom>
+                  </pic:spPr>
+                </pic:pic>
+              </a:graphicData>
+            </a:graphic>
+          </wp:inline>
+        </w:drawing>
+      </w:r>
+    </w:p>
+    <w:p>
+      <w:pPr>
+        <w:spacing w:after="240"/>
+        <w:jc w:val="center"/>
+      </w:pPr>
+      <w:r>
+        <w:rPr>
+          <w:i/>
+          <w:iCs/>
+          <w:sz w:val="18"/>
+          <w:szCs w:val="18"/>
+        </w:rPr>
+        <w:t xml:space="preserve">Figure 4: Out-of-fold confusion matrices for Random Forest, all four leads, corrected (row-normalized % with raw counts in parentheses).</w:t>
+      </w:r>
+    </w:p>
+    <w:p>
+      <w:pPr>
+        <w:spacing w:after="160"/>
+      </w:pPr>
+      <w:r>
+        <w:rPr>
+          <w:b/>
+          <w:bCs/>
+        </w:rPr>
+        <w:t xml:space="preserve">Three consistent patterns stand out:</w:t>
+      </w:r>
+    </w:p>
+    <w:p>
+      <w:pPr>
+        <w:spacing w:after="160"/>
+      </w:pPr>
+      <w:r>
+        <w:t xml:space="preserve">•  The Normal class is recognized reliably everywhere (81-87% recall) — the model rarely mistakes a genuinely normal beat for a pathological one.</w:t>
+      </w:r>
+    </w:p>
+    <w:p>
+      <w:pPr>
+        <w:spacing w:after="160"/>
+      </w:pPr>
+      <w:r>
+        <w:t xml:space="preserve">•  AS recall varies sharply by lead: only 43% on Lead I, but 81% on V2 — V2 appears to be a particularly informative lead for this specific pathology, consistent with V2's anatomical position over the anteroseptal region.</w:t>
+      </w:r>
+    </w:p>
+    <w:p>
+      <w:pPr>
+        <w:spacing w:after="160"/>
+      </w:pPr>
+      <w:r>
+        <w:t xml:space="preserve">•  IPL — the rarest pathological class — is recognized poorly on three of the four leads (6% recall on Lead I, aVR, and V6), and only moderately on V2 (49%). This lines up with the known data limitation noted throughout this project: IPL has substantially fewer training patients than the other classes, and is the most consistent weak point across every lead and every method tested.</w:t>
+      </w:r>
+    </w:p>
+    <w:p>
+      <w:r>
+        <w:br w:type="page"/>
+      </w:r>
+    </w:p>
+    <w:p>
+      <w:pPr>
+        <w:pStyle w:val="Heading1"/>
+        <w:spacing w:after="140" w:before="280"/>
+      </w:pPr>
+      <w:r>
+        <w:rPr>
+          <w:b/>
+          <w:bCs/>
+        </w:rPr>
+        <w:t xml:space="preserve">4. Discussion</w:t>
+      </w:r>
+    </w:p>
+    <w:p>
+      <w:pPr>
+        <w:spacing w:after="160"/>
+      </w:pPr>
+      <w:r>
+        <w:rPr>
+          <w:b/>
+          <w:bCs/>
+        </w:rPr>
+        <w:t xml:space="preserve">4.1 Random Forest wins consistently and by a clear margin</w:t>
+      </w:r>
+    </w:p>
+    <w:p>
+      <w:pPr>
+        <w:spacing w:after="160"/>
+      </w:pPr>
+      <w:r>
+        <w:t xml:space="preserve">Random Forest achieved the best Macro-F1 on all four leads without exception, and by a margin exceeding the typical fold-to-fold standard deviation in most cases — most clearly on V2, where it beat the next-best method (Decision Tree) by 4 percentage points. This confirms and generalizes the earlier Nearest-Centroid-vs-RF finding: Random Forest's advantage is not specific to that one comparison — it outperformed all five other methods tested here as well.</w:t>
+      </w:r>
+    </w:p>
+    <w:p>
+      <w:pPr>
+        <w:spacing w:after="160"/>
+      </w:pPr>
+      <w:r>
+        <w:rPr>
+          <w:b/>
+          <w:bCs/>
+        </w:rPr>
+        <w:t xml:space="preserve">4.2 Decision Tree and SVM are close runners-up, well ahead of centroid-based methods</w:t>
       </w:r>
     </w:p>
     <w:p>
@@ -3358,26 +3499,121 @@
           <w:b w:val="false"/>
           <w:bCs w:val="false"/>
         </w:rPr>
-        <w:t xml:space="preserve">Out-of-fold confusion matrices (aggregating every patient's held-out prediction into one matrix per lead) are a natural next diagnostic step, but are </w:t>
-      </w:r>
+        <w:t xml:space="preserve">Averaged across leads, a single Decision Tree (avg. Macro-F1 0.458) and SVM with an RBF kernel (avg. 0.452) are nearly tied for second place — closer to each other than to Random Forest above them or to PCA+Logistic Regression below. This is a more nuanced picture than a simple "ensembles beat everything else": a lone decision tree, despite its known high variance, performs competitively here, while Random Forest's ensemble averaging still adds a clear, consistent margin over its own individual building block on every lead.</w:t>
+      </w:r>
+    </w:p>
+    <w:p>
+      <w:pPr>
+        <w:spacing w:after="160"/>
+      </w:pPr>
       <w:r>
         <w:rPr>
           <w:b/>
           <w:bCs/>
         </w:rPr>
-        <w:t xml:space="preserve">not included in this revision</w:t>
-      </w:r>
+        <w:t xml:space="preserve">4.3 Centroid-based methods are consistently the weakest</w:t>
+      </w:r>
+    </w:p>
+    <w:p>
+      <w:pPr>
+        <w:spacing w:after="160"/>
+      </w:pPr>
       <w:r>
         <w:rPr>
           <w:b w:val="false"/>
           <w:bCs w:val="false"/>
         </w:rPr>
-        <w:t xml:space="preserve">: the confusion matrices produced in an earlier pass used the pre-fix diagnostics script, and are no longer consistent with the corrected Macro-F1 figures in Section 3.2 above. `tools/diagnostics_experiment_colab.py` has already been updated with the same class-label fix (Section 5) and is ready to re-run; the resulting matrices will be added once available.</w:t>
-      </w:r>
-    </w:p>
-    <w:p>
-      <w:r>
-        <w:br w:type="page"/>
+        <w:t xml:space="preserve">Nearest Centroid was the weakest method on 3 of 4 leads, and its generalization to multiple prototypes per class (Cluster Prototypes) improved on it only slightly. This suggests that distinguishing pathological classes is </w:t>
+      </w:r>
+      <w:r>
+        <w:rPr>
+          <w:b/>
+          <w:bCs/>
+        </w:rPr>
+        <w:t xml:space="preserve">not simply a shift of the centre of mass</w:t>
+      </w:r>
+      <w:r>
+        <w:rPr>
+          <w:b w:val="false"/>
+          <w:bCs w:val="false"/>
+        </w:rPr>
+        <w:t xml:space="preserve">, as the centroid assumption implies, but depends on finer interactions between specific positions within the beat — exactly the kind of pattern that tree-based and non-linear-margin models capture better than a direct Euclidean distance.</w:t>
+      </w:r>
+    </w:p>
+    <w:p>
+      <w:pPr>
+        <w:spacing w:after="160"/>
+      </w:pPr>
+      <w:r>
+        <w:rPr>
+          <w:b/>
+          <w:bCs/>
+        </w:rPr>
+        <w:t xml:space="preserve">4.4 Dimensionality reduction does not close the gap</w:t>
+      </w:r>
+    </w:p>
+    <w:p>
+      <w:pPr>
+        <w:spacing w:after="160"/>
+      </w:pPr>
+      <w:r>
+        <w:rPr>
+          <w:b w:val="false"/>
+          <w:bCs w:val="false"/>
+        </w:rPr>
+        <w:t xml:space="preserve">PCA+Logistic Regression improved on the centroid-based methods but still trailed Random Forest and SVM on every lead. This indicates that the "curse of dimensionality" from 400 raw samples is </w:t>
+      </w:r>
+      <w:r>
+        <w:rPr>
+          <w:b/>
+          <w:bCs/>
+        </w:rPr>
+        <w:t xml:space="preserve">not</w:t>
+      </w:r>
+      <w:r>
+        <w:rPr>
+          <w:b w:val="false"/>
+          <w:bCs w:val="false"/>
+        </w:rPr>
+        <w:t xml:space="preserve"> the primary cause of the performance gap — even after reducing dimensionality, a simple linear model did not close the gap with the non-linear models. The deeper issue appears to be the non-linear nature of the underlying relationship itself, not the number of dimensions.</w:t>
+      </w:r>
+    </w:p>
+    <w:p>
+      <w:pPr>
+        <w:spacing w:after="160"/>
+      </w:pPr>
+      <w:r>
+        <w:rPr>
+          <w:b/>
+          <w:bCs/>
+        </w:rPr>
+        <w:t xml:space="preserve">4.5 The most important finding: even the best method remains moderately accurate</w:t>
+      </w:r>
+    </w:p>
+    <w:p>
+      <w:pPr>
+        <w:spacing w:after="160"/>
+      </w:pPr>
+      <w:r>
+        <w:rPr>
+          <w:b w:val="false"/>
+          <w:bCs w:val="false"/>
+        </w:rPr>
+        <w:t xml:space="preserve">Despite its clear lead over the other five methods, Random Forest's best result (60.8% on V2) remains well short of a level of reliability suitable for independent clinical use. This matches the earlier experiment's conclusion: </w:t>
+      </w:r>
+      <w:r>
+        <w:rPr>
+          <w:b/>
+          <w:bCs/>
+        </w:rPr>
+        <w:t xml:space="preserve">the choice of classification algorithm is not the primary bottleneck</w:t>
+      </w:r>
+      <w:r>
+        <w:rPr>
+          <w:b w:val="false"/>
+          <w:bCs w:val="false"/>
+        </w:rPr>
+        <w:t xml:space="preserve"> in this problem — none of the six methods compared here crossed that ceiling. The confusion matrices reinforce this: Normal beats are separated reliably, but the rarest pathological class (IPL) is missed on most leads regardless of classifier, pointing to a data-availability limitation rather than an algorithmic one.</w:t>
       </w:r>
     </w:p>
     <w:p>
@@ -3390,239 +3626,60 @@
           <w:b/>
           <w:bCs/>
         </w:rPr>
-        <w:t xml:space="preserve">4. Discussion</w:t>
-      </w:r>
-    </w:p>
-    <w:p>
-      <w:pPr>
-        <w:spacing w:after="160"/>
-      </w:pPr>
+        <w:t xml:space="preserve">5. A Correction Applied Before This Revision</w:t>
+      </w:r>
+    </w:p>
+    <w:p>
+      <w:pPr>
+        <w:spacing w:after="160"/>
+      </w:pPr>
+      <w:r>
+        <w:rPr>
+          <w:b w:val="false"/>
+          <w:bCs w:val="false"/>
+        </w:rPr>
+        <w:t xml:space="preserve">An earlier pass of this comparison contained a </w:t>
+      </w:r>
       <w:r>
         <w:rPr>
           <w:b/>
           <w:bCs/>
         </w:rPr>
-        <w:t xml:space="preserve">4.1 Random Forest wins consistently and by a clear margin</w:t>
-      </w:r>
-    </w:p>
-    <w:p>
-      <w:pPr>
-        <w:spacing w:after="160"/>
-      </w:pPr>
-      <w:r>
-        <w:t xml:space="preserve">Random Forest achieved the best Macro-F1 on all four leads without exception, and by a margin exceeding the typical fold-to-fold standard deviation in most cases — most clearly on V2, where it beat the next-best method (Decision Tree) by 4 percentage points. This confirms and generalizes the earlier Nearest-Centroid-vs-RF finding: Random Forest's advantage is not specific to that one comparison — it outperformed all five other methods tested here as well.</w:t>
-      </w:r>
-    </w:p>
-    <w:p>
-      <w:pPr>
-        <w:spacing w:after="160"/>
-      </w:pPr>
+        <w:t xml:space="preserve">cross-lead class-label mismatch</w:t>
+      </w:r>
+      <w:r>
+        <w:rPr>
+          <w:b w:val="false"/>
+          <w:bCs w:val="false"/>
+        </w:rPr>
+        <w:t xml:space="preserve">: aVR, V2, and V6 are documented in the project as not supporting the "A" (Anterior) pathology class for stemming purposes. However, because all four leads are simultaneous recordings of the same patients, "A"-labeled beats were still physically present in the cached data for these three leads, and the original comparison script did not exclude them from training or evaluation — effectively scoring these leads on five classes instead of the four the production model actually targets there. This was corrected by filtering each lead's data to {Normal} ∪ its documented pathological classes before any envelope-building, stemming, or classifier fit/predict. </w:t>
+      </w:r>
       <w:r>
         <w:rPr>
           <w:b/>
           <w:bCs/>
         </w:rPr>
-        <w:t xml:space="preserve">4.2 Decision Tree and SVM are close runners-up, well ahead of centroid-based methods</w:t>
-      </w:r>
-    </w:p>
-    <w:p>
-      <w:pPr>
-        <w:spacing w:after="160"/>
-      </w:pPr>
+        <w:t xml:space="preserve">All numbers in Section 3 above already reflect this fix</w:t>
+      </w:r>
       <w:r>
         <w:rPr>
           <w:b w:val="false"/>
           <w:bCs w:val="false"/>
         </w:rPr>
-        <w:t xml:space="preserve">Averaged across leads, a single Decision Tree (avg. Macro-F1 0.458) and SVM with an RBF kernel (avg. 0.452) are nearly tied for second place — closer to each other than to Random Forest above them or to PCA+Logistic Regression below. This is a more nuanced picture than a simple "ensembles beat everything else": a lone decision tree, despite its known high variance, performs competitively here, while Random Forest's ensemble averaging still adds a clear, consistent margin over its own individual building block on every lead.</w:t>
-      </w:r>
-    </w:p>
-    <w:p>
-      <w:pPr>
-        <w:spacing w:after="160"/>
+        <w:t xml:space="preserve"> (376 patients / 4,529 beats for aVR, V2, V6, versus the full 492 / 5,952 for Lead I) — the corrected scores are meaningfully higher than the pre-fix pass (e.g. Random Forest on V2 rose from 52.9% to 60.8%), confirming the earlier numbers had understated real performance on these three leads.</w:t>
+      </w:r>
+    </w:p>
+    <w:p>
+      <w:pPr>
+        <w:pStyle w:val="Heading1"/>
+        <w:spacing w:after="140" w:before="280"/>
       </w:pPr>
       <w:r>
         <w:rPr>
           <w:b/>
           <w:bCs/>
         </w:rPr>
-        <w:t xml:space="preserve">4.3 Centroid-based methods are consistently the weakest</w:t>
-      </w:r>
-    </w:p>
-    <w:p>
-      <w:pPr>
-        <w:spacing w:after="160"/>
-      </w:pPr>
-      <w:r>
-        <w:rPr>
-          <w:b w:val="false"/>
-          <w:bCs w:val="false"/>
-        </w:rPr>
-        <w:t xml:space="preserve">Nearest Centroid was the weakest method on 3 of 4 leads, and its generalization to multiple prototypes per class (Cluster Prototypes) improved on it only slightly. This suggests that distinguishing pathological classes is </w:t>
-      </w:r>
-      <w:r>
-        <w:rPr>
-          <w:b/>
-          <w:bCs/>
-        </w:rPr>
-        <w:t xml:space="preserve">not simply a shift of the centre of mass</w:t>
-      </w:r>
-      <w:r>
-        <w:rPr>
-          <w:b w:val="false"/>
-          <w:bCs w:val="false"/>
-        </w:rPr>
-        <w:t xml:space="preserve">, as the centroid assumption implies, but depends on finer interactions between specific positions within the beat — exactly the kind of pattern that tree-based and non-linear-margin models capture better than a direct Euclidean distance.</w:t>
-      </w:r>
-    </w:p>
-    <w:p>
-      <w:pPr>
-        <w:spacing w:after="160"/>
-      </w:pPr>
-      <w:r>
-        <w:rPr>
-          <w:b/>
-          <w:bCs/>
-        </w:rPr>
-        <w:t xml:space="preserve">4.4 Dimensionality reduction does not close the gap</w:t>
-      </w:r>
-    </w:p>
-    <w:p>
-      <w:pPr>
-        <w:spacing w:after="160"/>
-      </w:pPr>
-      <w:r>
-        <w:rPr>
-          <w:b w:val="false"/>
-          <w:bCs w:val="false"/>
-        </w:rPr>
-        <w:t xml:space="preserve">PCA+Logistic Regression improved on the centroid-based methods but still trailed Random Forest and SVM on every lead. This indicates that the "curse of dimensionality" from 400 raw samples is </w:t>
-      </w:r>
-      <w:r>
-        <w:rPr>
-          <w:b/>
-          <w:bCs/>
-        </w:rPr>
-        <w:t xml:space="preserve">not</w:t>
-      </w:r>
-      <w:r>
-        <w:rPr>
-          <w:b w:val="false"/>
-          <w:bCs w:val="false"/>
-        </w:rPr>
-        <w:t xml:space="preserve"> the primary cause of the performance gap — even after reducing dimensionality, a simple linear model did not close the gap with the non-linear models. The deeper issue appears to be the non-linear nature of the underlying relationship itself, not the number of dimensions.</w:t>
-      </w:r>
-    </w:p>
-    <w:p>
-      <w:pPr>
-        <w:spacing w:after="160"/>
-      </w:pPr>
-      <w:r>
-        <w:rPr>
-          <w:b/>
-          <w:bCs/>
-        </w:rPr>
-        <w:t xml:space="preserve">4.5 The most important finding: even the best method remains moderately accurate</w:t>
-      </w:r>
-    </w:p>
-    <w:p>
-      <w:pPr>
-        <w:spacing w:after="160"/>
-      </w:pPr>
-      <w:r>
-        <w:rPr>
-          <w:b w:val="false"/>
-          <w:bCs w:val="false"/>
-        </w:rPr>
-        <w:t xml:space="preserve">Despite its clear lead over the other five methods, Random Forest's best result (60.8% on V2) remains well short of a level of reliability suitable for independent clinical use. This matches the earlier experiment's conclusion: </w:t>
-      </w:r>
-      <w:r>
-        <w:rPr>
-          <w:b/>
-          <w:bCs/>
-        </w:rPr>
-        <w:t xml:space="preserve">the choice of classification algorithm is not the primary bottleneck</w:t>
-      </w:r>
-      <w:r>
-        <w:rPr>
-          <w:b w:val="false"/>
-          <w:bCs w:val="false"/>
-        </w:rPr>
-        <w:t xml:space="preserve"> in this problem — none of the six methods compared here crossed that ceiling.</w:t>
-      </w:r>
-    </w:p>
-    <w:p>
-      <w:pPr>
-        <w:pStyle w:val="Heading1"/>
-        <w:spacing w:after="140" w:before="280"/>
-      </w:pPr>
-      <w:r>
-        <w:rPr>
-          <w:b/>
-          <w:bCs/>
-        </w:rPr>
-        <w:t xml:space="preserve">5. A Correction Applied Before This Revision</w:t>
-      </w:r>
-    </w:p>
-    <w:p>
-      <w:pPr>
-        <w:spacing w:after="160"/>
-      </w:pPr>
-      <w:r>
-        <w:rPr>
-          <w:b w:val="false"/>
-          <w:bCs w:val="false"/>
-        </w:rPr>
-        <w:t xml:space="preserve">An earlier pass of this comparison contained a </w:t>
-      </w:r>
-      <w:r>
-        <w:rPr>
-          <w:b/>
-          <w:bCs/>
-        </w:rPr>
-        <w:t xml:space="preserve">cross-lead class-label mismatch</w:t>
-      </w:r>
-      <w:r>
-        <w:rPr>
-          <w:b w:val="false"/>
-          <w:bCs w:val="false"/>
-        </w:rPr>
-        <w:t xml:space="preserve">: aVR, V2, and V6 are documented in the project as not supporting the "A" (Anterior) pathology class for stemming purposes. However, because all four leads are simultaneous recordings of the same patients, "A"-labeled beats were still physically present in the cached data for these three leads, and the original comparison script did not exclude them from training or evaluation — effectively scoring these leads on five classes instead of the four the production model actually targets there. This was corrected by filtering each lead's data to {Normal} ∪ its documented pathological classes before any envelope-building, stemming, or classifier fit/predict. </w:t>
-      </w:r>
-      <w:r>
-        <w:rPr>
-          <w:b/>
-          <w:bCs/>
-        </w:rPr>
-        <w:t xml:space="preserve">All numbers in Section 3 above already reflect this fix</w:t>
-      </w:r>
-      <w:r>
-        <w:rPr>
-          <w:b w:val="false"/>
-          <w:bCs w:val="false"/>
-        </w:rPr>
-        <w:t xml:space="preserve"> (376 patients / 4,529 beats for aVR, V2, V6, versus the full 492 / 5,952 for Lead I) — the corrected scores are meaningfully higher than the pre-fix pass (e.g. Random Forest on V2 rose from 52.9% to 60.8%), confirming the earlier numbers had understated real performance on these three leads.</w:t>
-      </w:r>
-    </w:p>
-    <w:p>
-      <w:pPr>
-        <w:pStyle w:val="Heading1"/>
-        <w:spacing w:after="140" w:before="280"/>
-      </w:pPr>
-      <w:r>
-        <w:rPr>
-          <w:b/>
-          <w:bCs/>
-        </w:rPr>
         <w:t xml:space="preserve">6. Limitations</w:t>
-      </w:r>
-    </w:p>
-    <w:p>
-      <w:pPr>
-        <w:spacing w:after="160"/>
-      </w:pPr>
-      <w:r>
-        <w:t xml:space="preserve">•  Out-of-fold confusion matrices are not yet included in this revision (see Section 3.3) — the diagnostics script has been updated with the same class-label fix but not yet re-run.</w:t>
       </w:r>
     </w:p>
     <w:p>

</xml_diff>

<commit_message>
Fix article structure: real Related Work section, merged methodology explanation, document identity
- Adds section 1.1 Related Work: a genuine literature-review narrative
  citing all 20 references in-text ([1]-[20]) instead of a bare
  bibliography, explaining how each prior study relates to this one and
  what distinguishes this comparison's scope/rigor.
- Merges the plain-language processing walkthrough directly into
  Methodology section 2.2 (previously a disconnected standalone section
  at the end of the document).
- Sets document core properties (title, subject, creator, description)
  so file metadata is populated; per explicit instruction, no personal
  author name/affiliation is shown -- only project name and date on the
  title page and 'ecg-mi-classifier-v4 project' as document creator.
</commit_message>
<xml_diff>
--- a/docs/classifier_comparison_article_EN.docx
+++ b/docs/classifier_comparison_article_EN.docx
@@ -19,7 +19,7 @@
     </w:p>
     <w:p>
       <w:pPr>
-        <w:spacing w:after="300"/>
+        <w:spacing w:after="140"/>
         <w:jc w:val="center"/>
       </w:pPr>
       <w:r>
@@ -34,6 +34,34 @@
     </w:p>
     <w:p>
       <w:pPr>
+        <w:spacing w:after="20"/>
+        <w:jc w:val="center"/>
+      </w:pPr>
+      <w:r>
+        <w:rPr>
+          <w:color w:val="666666"/>
+          <w:sz w:val="19"/>
+          <w:szCs w:val="19"/>
+        </w:rPr>
+        <w:t xml:space="preserve">Project: ecg-mi-classifier-v4</w:t>
+      </w:r>
+    </w:p>
+    <w:p>
+      <w:pPr>
+        <w:spacing w:after="300"/>
+        <w:jc w:val="center"/>
+      </w:pPr>
+      <w:r>
+        <w:rPr>
+          <w:color w:val="666666"/>
+          <w:sz w:val="19"/>
+          <w:szCs w:val="19"/>
+        </w:rPr>
+        <w:t xml:space="preserve">September 2026</w:t>
+      </w:r>
+    </w:p>
+    <w:p>
+      <w:pPr>
         <w:pStyle w:val="Heading1"/>
         <w:spacing w:after="140" w:before="280"/>
       </w:pPr>
@@ -95,6 +123,161 @@
     </w:p>
     <w:p>
       <w:pPr>
+        <w:pStyle w:val="Heading2"/>
+        <w:spacing w:after="140" w:before="280"/>
+      </w:pPr>
+      <w:r>
+        <w:rPr>
+          <w:b/>
+          <w:bCs/>
+        </w:rPr>
+        <w:t xml:space="preserve">1.1 Related Work</w:t>
+      </w:r>
+    </w:p>
+    <w:p>
+      <w:pPr>
+        <w:spacing w:after="160"/>
+      </w:pPr>
+      <w:r>
+        <w:rPr>
+          <w:b w:val="false"/>
+          <w:bCs w:val="false"/>
+        </w:rPr>
+        <w:t xml:space="preserve">The PTB-XL dataset used throughout this study [1] is the largest freely available clinical 12-lead ECG resource, built on the earlier PTB diagnostic database [4] and distributed through PhysioNet [5]. Its scale and patient-level annotation enabled the first standardized deep-learning benchmark across PTB-XL's diagnostic superclasses [2], later extended with a richer feature dataset [3] and further large-scale ML/DL benchmarking work [10].</w:t>
+      </w:r>
+    </w:p>
+    <w:p>
+      <w:pPr>
+        <w:spacing w:after="160"/>
+      </w:pPr>
+      <w:r>
+        <w:rPr>
+          <w:b w:val="false"/>
+          <w:bCs w:val="false"/>
+        </w:rPr>
+        <w:t xml:space="preserve">Within this ecosystem, several studies have applied </w:t>
+      </w:r>
+      <w:r>
+        <w:rPr>
+          <w:b/>
+          <w:bCs/>
+        </w:rPr>
+        <w:t xml:space="preserve">classical machine learning specifically to myocardial infarction detection</w:t>
+      </w:r>
+      <w:r>
+        <w:rPr>
+          <w:b w:val="false"/>
+          <w:bCs w:val="false"/>
+        </w:rPr>
+        <w:t xml:space="preserve">. Kolodziej et al. [6] compared SVM, KNN, and Random Forest for normal-vs-MI classification on the related PTB database under an inter-patient split, reporting that all three degrade gracefully under added noise but do not fully separate the classes. A short-time heart-rate-variability study [7] reported very high accuracy (99.6%) for Random Forest on PTB-XL, though on a much coarser sick/healthy task rather than infarct localization. A Lund University thesis [8] trained classical models (extracted morphological features) alongside a CNN on the same NORM-vs-MI split used here, finding the CNN ahead on raw accuracy but a classical SVM-CNN stacking ensemble best on ROC-AUC — consistent with this paper's own finding that non-linear classical methods (Random Forest, SVM) meaningfully outperform simpler linear or prototype-based ones even without deep learning. At the clinical end of this spectrum, Herman et al. [9] used a Random Forest-based score for occlusion-MI risk stratification directly from ECG, identifying lead-specific ST-T features (in aVL, V2, aVF) as the strongest predictors — a finding that resonates with this paper's own observation that V2 carries unusually strong discriminative signal for the AS class.</w:t>
+      </w:r>
+    </w:p>
+    <w:p>
+      <w:pPr>
+        <w:spacing w:after="160"/>
+      </w:pPr>
+      <w:r>
+        <w:rPr>
+          <w:b w:val="false"/>
+          <w:bCs w:val="false"/>
+        </w:rPr>
+        <w:t xml:space="preserve">A parallel line of work applies </w:t>
+      </w:r>
+      <w:r>
+        <w:rPr>
+          <w:b/>
+          <w:bCs/>
+        </w:rPr>
+        <w:t xml:space="preserve">deep learning</w:t>
+      </w:r>
+      <w:r>
+        <w:rPr>
+          <w:b w:val="false"/>
+          <w:bCs w:val="false"/>
+        </w:rPr>
+        <w:t xml:space="preserve"> directly to raw or minimally processed ECG signals: single-lead deep models for MI detection [11], integrated single/12-lead architectures [12], and few-shot learning approaches for PTB-XL's smaller classes [13]. These consistently report higher raw accuracy than classical pipelines, at the cost of requiring far larger training sets and offering less interpretable decision logic than an explicit stemming-plus-classifier approach — a trade-off this paper's Section 7 conclusion explicitly weighs against.</w:t>
+      </w:r>
+    </w:p>
+    <w:p>
+      <w:pPr>
+        <w:spacing w:after="160"/>
+      </w:pPr>
+      <w:r>
+        <w:rPr>
+          <w:b w:val="false"/>
+          <w:bCs w:val="false"/>
+        </w:rPr>
+        <w:t xml:space="preserve">The shared preprocessing pipeline in Section 2 builds on </w:t>
+      </w:r>
+      <w:r>
+        <w:rPr>
+          <w:b/>
+          <w:bCs/>
+        </w:rPr>
+        <w:t xml:space="preserve">standard ECG signal-processing foundations</w:t>
+      </w:r>
+      <w:r>
+        <w:rPr>
+          <w:b w:val="false"/>
+          <w:bCs w:val="false"/>
+        </w:rPr>
+        <w:t xml:space="preserve">: R-peak detection descends from the classic Pan-Tompkins algorithm [14], still the most widely used QRS detector, and its more robust modern variants [15, 16].</w:t>
+      </w:r>
+    </w:p>
+    <w:p>
+      <w:pPr>
+        <w:spacing w:after="160"/>
+      </w:pPr>
+      <w:r>
+        <w:rPr>
+          <w:b w:val="false"/>
+          <w:bCs w:val="false"/>
+        </w:rPr>
+        <w:t xml:space="preserve">Finally, the </w:t>
+      </w:r>
+      <w:r>
+        <w:rPr>
+          <w:b/>
+          <w:bCs/>
+        </w:rPr>
+        <w:t xml:space="preserve">six classifiers compared in Section 3</w:t>
+      </w:r>
+      <w:r>
+        <w:rPr>
+          <w:b w:val="false"/>
+          <w:bCs w:val="false"/>
+        </w:rPr>
+        <w:t xml:space="preserve"> each rest on well-established theoretical foundations: Random Forest [17] and Support Vector Machines [18] are the two strongest performers here, consistent with their broad track record on structured tabular and signal-derived features; the Nearest Centroid and Cluster Prototype methods are direct descendants of the nearest-shrunken-centroid idea introduced for high-dimensional gene-expression classification [19], adapted here to per-class envelope construction instead of gene shrinkage; and the PCA step tested against the curse of dimensionality follows the classical formulation and later review of principal component analysis [20].</w:t>
+      </w:r>
+    </w:p>
+    <w:p>
+      <w:pPr>
+        <w:spacing w:after="160"/>
+      </w:pPr>
+      <w:r>
+        <w:rPr>
+          <w:b w:val="false"/>
+          <w:bCs w:val="false"/>
+        </w:rPr>
+        <w:t xml:space="preserve"/>
+      </w:r>
+      <w:r>
+        <w:rPr>
+          <w:b/>
+          <w:bCs/>
+        </w:rPr>
+        <w:t xml:space="preserve">What distinguishes this study</w:t>
+      </w:r>
+      <w:r>
+        <w:rPr>
+          <w:b w:val="false"/>
+          <w:bCs w:val="false"/>
+        </w:rPr>
+        <w:t xml:space="preserve"> from [6]-[9] above is scope and evaluation rigor rather than raw accuracy: those studies typically compare one or two classifiers, often without a hard patient-level split. This paper compares six classifier families side by side under one identical preprocessing pipeline and one identical patient-level GroupKFold protocol, explicitly designed to surface (rather than hide) any residual generalization gap.</w:t>
+      </w:r>
+    </w:p>
+    <w:p>
+      <w:pPr>
         <w:pStyle w:val="Heading1"/>
         <w:spacing w:after="140" w:before="280"/>
       </w:pPr>
@@ -144,6 +327,18 @@
       </w:pPr>
       <w:r>
         <w:t xml:space="preserve">For every beat, a statistical envelope (mean ± k·std) is built for each class separately — the Normal class and every pathological class individually, not only Normal as in the classic approach. "Intersection stemming" then keeps only the samples of a beat that fall outside the Normal envelope AND inside at least one pathological class's envelope; every other sample is zeroed out, including anything past the beat's own dynamic cutoff point. This exact representation, at the same k for a given run, is fed to all six classifiers, which is what makes the comparison fair.</w:t>
+      </w:r>
+    </w:p>
+    <w:p>
+      <w:pPr>
+        <w:spacing w:after="160"/>
+      </w:pPr>
+      <w:r>
+        <w:rPr>
+          <w:i/>
+          <w:iCs/>
+        </w:rPr>
+        <w:t xml:space="preserve">In plain terms: every heartbeat passes through four steps before reaching any classifier. First, noise and slow baseline drift (e.g. from a patient's breathing) are removed. Second, the R-peak of the beat is located as a reference point, and a fixed window is cut around it (100 samples before, 300 after). Third, a small correction is applied using the quiet PR segment just before the peak, so the beat's zero-level is accurate. Fourth and finally, the beat's shape is compared against the statistically-derived "normal" range described above — any portion that matches what is expected is zeroed out entirely, leaving only the "unusual" portion that may carry diagnostic signal. It is only this residual portion — not the whole beat — that is fed to any of the six methods compared in this study.</w:t>
       </w:r>
     </w:p>
     <w:p>
@@ -3745,28 +3940,7 @@
           <w:b/>
           <w:bCs/>
         </w:rPr>
-        <w:t xml:space="preserve">8. Simplified Explanation of the Processing Pipeline</w:t>
-      </w:r>
-    </w:p>
-    <w:p>
-      <w:pPr>
-        <w:spacing w:after="160"/>
-      </w:pPr>
-      <w:r>
-        <w:t xml:space="preserve">For readers without a signal-processing background, every heartbeat passes through four steps before reaching any classifier. First, noise and slow baseline drift (e.g. from a patient's breathing) are removed. Second, the R-peak of the beat is located as a reference point, and a fixed window is cut around it (100 samples before, 300 after). Third, a small correction is applied using the quiet PR segment just before the peak, so the beat's zero-level is accurate. Fourth and finally, the beat's shape is compared against a statistically-derived "normal" range — any portion that matches what is expected is zeroed out entirely ("stemming"), leaving only the "unusual" portion that may carry diagnostic signal. It is only this residual portion — not the whole beat — that is fed to any of the six methods compared in this study.</w:t>
-      </w:r>
-    </w:p>
-    <w:p>
-      <w:pPr>
-        <w:pStyle w:val="Heading1"/>
-        <w:spacing w:after="140" w:before="280"/>
-      </w:pPr>
-      <w:r>
-        <w:rPr>
-          <w:b/>
-          <w:bCs/>
-        </w:rPr>
-        <w:t xml:space="preserve">9. Data and Code Availability</w:t>
+        <w:t xml:space="preserve">8. Data and Code Availability</w:t>
       </w:r>
     </w:p>
     <w:p>

</xml_diff>

<commit_message>
Number and cross-reference all tables and figures
Adds Table 1-6 captions (bold, above each table, matching figure caption
convention below each figure) and integrates explicit in-text references
throughout the prose (e.g. 'Table 1 reports...', 'Figure 2 illustrates...',
'Figure 4 combines...') instead of leaving tables/figures unlabeled and
disconnected from the surrounding text. Also fixes a stale section
number in the References list (Section 9 -> 8, left over from an
earlier renumbering).
</commit_message>
<xml_diff>
--- a/docs/classifier_comparison_article_EN.docx
+++ b/docs/classifier_comparison_article_EN.docx
@@ -338,7 +338,7 @@
           <w:i/>
           <w:iCs/>
         </w:rPr>
-        <w:t xml:space="preserve">In plain terms: every heartbeat passes through four steps before reaching any classifier. First, noise and slow baseline drift (e.g. from a patient's breathing) are removed. Second, the R-peak of the beat is located as a reference point, and a fixed window is cut around it (100 samples before, 300 after). Third, a small correction is applied using the quiet PR segment just before the peak, so the beat's zero-level is accurate. Fourth and finally, the beat's shape is compared against the statistically-derived "normal" range described above — any portion that matches what is expected is zeroed out entirely, leaving only the "unusual" portion that may carry diagnostic signal. It is only this residual portion — not the whole beat — that is fed to any of the six methods compared in this study.</w:t>
+        <w:t xml:space="preserve">In plain terms: every heartbeat passes through four steps before reaching any classifier. First, noise and slow baseline drift (e.g. from a patient's breathing) are removed. Second, the R-peak of the beat is located as a reference point, and a fixed window is cut around it (100 samples before, 300 after). Third, a small correction is applied using the quiet PR segment just before the peak, so the beat's zero-level is accurate. Fourth and finally, the beat's shape is compared against the statistically-derived "normal" range described above — any portion that matches what is expected is zeroed out entirely, leaving only the "unusual" portion that may carry diagnostic signal. It is only this residual portion — not the whole beat — that is fed to any of the six methods compared in this study, as Figure 1 illustrates.</w:t>
       </w:r>
     </w:p>
     <w:p>
@@ -464,6 +464,14 @@
     </w:p>
     <w:p>
       <w:pPr>
+        <w:spacing w:after="160"/>
+      </w:pPr>
+      <w:r>
+        <w:t xml:space="preserve">Figure 2 illustrates how all six methods branch from this one shared feature vector into a predicted class:</w:t>
+      </w:r>
+    </w:p>
+    <w:p>
+      <w:pPr>
         <w:spacing w:after="80" w:before="240"/>
         <w:jc w:val="center"/>
       </w:pPr>
@@ -578,7 +586,21 @@
         <w:spacing w:after="160"/>
       </w:pPr>
       <w:r>
-        <w:t xml:space="preserve">Before comparing classifiers, it is worth quantifying how much of the raw beat intersection stemming actually removes. Across all four leads, between 77.6% and 80.6% of the 400 samples in a beat are zeroed out by stemming (measured on the full dataset, at k=1.25 — Random Forest's winning width on every lead):</w:t>
+        <w:t xml:space="preserve">Before comparing classifiers, it is worth quantifying how much of the raw beat intersection stemming actually removes. Table 1 reports this for all four leads, at k=1.25 (Random Forest's winning width on every lead), measured on the full dataset:</w:t>
+      </w:r>
+    </w:p>
+    <w:p>
+      <w:pPr>
+        <w:spacing w:after="60" w:before="200"/>
+      </w:pPr>
+      <w:r>
+        <w:rPr>
+          <w:b/>
+          <w:bCs/>
+          <w:sz w:val="19"/>
+          <w:szCs w:val="19"/>
+        </w:rPr>
+        <w:t xml:space="preserve">Table 1. Percentage of beat samples zeroed out by intersection stemming, per lead.</w:t>
       </w:r>
     </w:p>
     <w:tbl>
@@ -878,7 +900,7 @@
           <w:sz w:val="19"/>
           <w:szCs w:val="19"/>
         </w:rPr>
-        <w:t xml:space="preserve">In other words, each classifier is effectively working with roughly one-fifth of the original signal — a substantial dimensionality reduction achieved purely by domain-driven signal processing, before any classifier-specific feature selection.</w:t>
+        <w:t xml:space="preserve">As Table 1 shows, each classifier is effectively working with roughly one-fifth of the original signal — a substantial dimensionality reduction achieved purely by domain-driven signal processing, before any classifier-specific feature selection.</w:t>
       </w:r>
     </w:p>
     <w:p>
@@ -916,7 +938,7 @@
           <w:b w:val="false"/>
           <w:bCs w:val="false"/>
         </w:rPr>
-        <w:t xml:space="preserve"> each (the "A" pathology class, not supported on these leads, is excluded entirely rather than leaking into training/evaluation as five classes). Lead I is unaffected (it supports all four pathology classes) and remains at 492 patients / 5,952 beats. Best Macro-F1 achieved by each method, per lead (ordered by performance; ★ marks the best result on that lead):</w:t>
+        <w:t xml:space="preserve"> each (the "A" pathology class, not supported on these leads, is excluded entirely rather than leaking into training/evaluation as five classes). Lead I is unaffected (it supports all four pathology classes) and remains at 492 patients / 5,952 beats. Tables 2-5 report the best Macro-F1 achieved by each method, per lead (ordered by performance; ★ marks the best result on that lead):</w:t>
       </w:r>
     </w:p>
     <w:p>
@@ -930,6 +952,20 @@
           <w:bCs/>
         </w:rPr>
         <w:t xml:space="preserve">Lead I (492 patients, 5,952 beats)</w:t>
+      </w:r>
+    </w:p>
+    <w:p>
+      <w:pPr>
+        <w:spacing w:after="60" w:before="200"/>
+      </w:pPr>
+      <w:r>
+        <w:rPr>
+          <w:b/>
+          <w:bCs/>
+          <w:sz w:val="19"/>
+          <w:szCs w:val="19"/>
+        </w:rPr>
+        <w:t xml:space="preserve">Table 2. Macro-F1 by method, Lead I.</w:t>
       </w:r>
     </w:p>
     <w:tbl>
@@ -1466,6 +1502,20 @@
         <w:t xml:space="preserve">aVR (376 patients, 4,529 beats)</w:t>
       </w:r>
     </w:p>
+    <w:p>
+      <w:pPr>
+        <w:spacing w:after="60" w:before="200"/>
+      </w:pPr>
+      <w:r>
+        <w:rPr>
+          <w:b/>
+          <w:bCs/>
+          <w:sz w:val="19"/>
+          <w:szCs w:val="19"/>
+        </w:rPr>
+        <w:t xml:space="preserve">Table 3. Macro-F1 by method, aVR.</w:t>
+      </w:r>
+    </w:p>
     <w:tbl>
       <w:tblPr>
         <w:tblW w:type="dxa" w:w="7600"/>
@@ -2000,6 +2050,20 @@
         <w:t xml:space="preserve">V2 (376 patients, 4,529 beats)</w:t>
       </w:r>
     </w:p>
+    <w:p>
+      <w:pPr>
+        <w:spacing w:after="60" w:before="200"/>
+      </w:pPr>
+      <w:r>
+        <w:rPr>
+          <w:b/>
+          <w:bCs/>
+          <w:sz w:val="19"/>
+          <w:szCs w:val="19"/>
+        </w:rPr>
+        <w:t xml:space="preserve">Table 4. Macro-F1 by method, V2.</w:t>
+      </w:r>
+    </w:p>
     <w:tbl>
       <w:tblPr>
         <w:tblW w:type="dxa" w:w="7600"/>
@@ -2534,6 +2598,20 @@
         <w:t xml:space="preserve">V6 (376 patients, 4,529 beats)</w:t>
       </w:r>
     </w:p>
+    <w:p>
+      <w:pPr>
+        <w:spacing w:after="60" w:before="200"/>
+      </w:pPr>
+      <w:r>
+        <w:rPr>
+          <w:b/>
+          <w:bCs/>
+          <w:sz w:val="19"/>
+          <w:szCs w:val="19"/>
+        </w:rPr>
+        <w:t xml:space="preserve">Table 5. Macro-F1 by method, V6.</w:t>
+      </w:r>
+    </w:p>
     <w:tbl>
       <w:tblPr>
         <w:tblW w:type="dxa" w:w="7600"/>
@@ -3063,6 +3141,28 @@
           <w:bCs/>
         </w:rPr>
         <w:t xml:space="preserve">Overall ranking (average across the four leads)</w:t>
+      </w:r>
+    </w:p>
+    <w:p>
+      <w:pPr>
+        <w:spacing w:after="160"/>
+      </w:pPr>
+      <w:r>
+        <w:t xml:space="preserve">Table 6 and Figure 3 summarize the same results averaged across leads, giving an overall ranking of the six methods:</w:t>
+      </w:r>
+    </w:p>
+    <w:p>
+      <w:pPr>
+        <w:spacing w:after="60" w:before="200"/>
+      </w:pPr>
+      <w:r>
+        <w:rPr>
+          <w:b/>
+          <w:bCs/>
+          <w:sz w:val="19"/>
+          <w:szCs w:val="19"/>
+        </w:rPr>
+        <w:t xml:space="preserve">Table 6. Overall ranking by average Macro-F1 across all four leads.</w:t>
       </w:r>
     </w:p>
     <w:tbl>
@@ -3535,7 +3635,7 @@
         <w:spacing w:after="160"/>
       </w:pPr>
       <w:r>
-        <w:t xml:space="preserve">Aggregate Macro-F1 hides which specific confusions drive the score. The matrices below combine every patient's out-of-fold prediction (each patient predicted exactly once, from a fold that never saw them during training) into a single confusion matrix per lead, for Random Forest — the overall winning method. aVR, V2, and V6 are shown with their four supported classes only, reflecting the fix in Section 5.</w:t>
+        <w:t xml:space="preserve">Aggregate Macro-F1 hides which specific confusions drive the score. Figure 4 combines every patient's out-of-fold prediction (each patient predicted exactly once, from a fold that never saw them during training) into a single confusion matrix per lead, for Random Forest — the overall winning method. aVR, V2, and V6 are shown with their four supported classes only, reflecting the fix in Section 5.</w:t>
       </w:r>
     </w:p>
     <w:p>
@@ -4253,7 +4353,7 @@
         <w:spacing w:after="160"/>
       </w:pPr>
       <w:r>
-        <w:t xml:space="preserve">Full reproducible experiment scripts: tools/classifier_comparison_experiment_colab.py and tools/diagnostics_experiment_colab.py in the project repository (see Section 9).</w:t>
+        <w:t xml:space="preserve">Full reproducible experiment scripts: tools/classifier_comparison_experiment_colab.py and tools/diagnostics_experiment_colab.py in the project repository (see Section 8).</w:t>
       </w:r>
     </w:p>
     <w:sectPr>

</xml_diff>